<commit_message>
v0.5.9 Gestión del estado del hardware y guardado de sesión
Agregue monitoreo robusto de conexión de hardware y persistencia de sesión. MonitorEndoscopiaUI ahora rastrea el estado anterior de SerialManager, centraliza VigilarHardware con salida anticipada, actualiza alertas de conexión, fuerza/bloquea el modo PC cuando es necesario y pausa automáticamente al desconectarse. Genera un informe de penalizaciones y ensambla un objeto SesionPractica para guardar el JSON de la sesión a través de HistoryManager. HistoryManager ahora usa ManejadorPartida.rutaGuardado cuando se proporciona. También un pequeño ajuste de la interfaz de usuario (alfa de color de MenuPrincipal) y grandes actualizaciones de metadatos de diseño de Unity; reemplace el archivo .docx principal y elimine el archivo temporal
</commit_message>
<xml_diff>
--- a/aplicacion/GDD Simulador de Extracción de Pólipos Intestinales.docx
+++ b/aplicacion/GDD Simulador de Extracción de Pólipos Intestinales.docx
@@ -409,6 +409,7 @@
           <w:lang w:val="es-BO"/>
         </w:rPr>
       </w:pPr>
+      <w:bookmarkStart w:id="0" w:name="_GoBack"/>
       <w:r>
         <w:rPr>
           <w:rStyle w:val="citation-644"/>
@@ -425,7 +426,23 @@
           <w:rFonts w:eastAsiaTheme="majorEastAsia"/>
           <w:lang w:val="es-BO"/>
         </w:rPr>
-        <w:t xml:space="preserve"> Práctica rápida guiada con 3 pólipos predefinidos para enseñar los controles y cómo resolver el procedimiento</w:t>
+        <w:t xml:space="preserve"> Práctica rápida guiada con </w:t>
+      </w:r>
+      <w:r>
+        <w:rPr>
+          <w:rStyle w:val="citation-644"/>
+          <w:rFonts w:eastAsiaTheme="majorEastAsia"/>
+          <w:lang w:val="es-BO"/>
+        </w:rPr>
+        <w:t>5</w:t>
+      </w:r>
+      <w:r>
+        <w:rPr>
+          <w:rStyle w:val="citation-644"/>
+          <w:rFonts w:eastAsiaTheme="majorEastAsia"/>
+          <w:lang w:val="es-BO"/>
+        </w:rPr>
+        <w:t xml:space="preserve"> pólipos predefinidos para enseñar los controles y cómo resolver el procedimiento</w:t>
       </w:r>
       <w:r>
         <w:rPr>
@@ -632,6 +649,7 @@
         <w:t>.</w:t>
       </w:r>
     </w:p>
+    <w:bookmarkEnd w:id="0"/>
     <w:p>
       <w:pPr>
         <w:pStyle w:val="Ttulo1"/>
@@ -1733,7 +1751,47 @@
         <w:rPr>
           <w:lang w:val="es-BO"/>
         </w:rPr>
-        <w:t>Porcentaje de Exploración Visual: Uso adecuado del torque para revisar detrás de los pliegues intestinales sin dejar puntos ciegos.</w:t>
+        <w:t xml:space="preserve">Porcentaje de Exploración Visual: </w:t>
+      </w:r>
+      <w:r>
+        <w:rPr>
+          <w:lang w:val="es-BO"/>
+        </w:rPr>
+        <w:t>llegar a sacar todos los pólipos y haber revisado el intestino (</w:t>
+      </w:r>
+      <w:proofErr w:type="spellStart"/>
+      <w:r>
+        <w:rPr>
+          <w:lang w:val="es-BO"/>
+        </w:rPr>
+        <w:t>almenos</w:t>
+      </w:r>
+      <w:proofErr w:type="spellEnd"/>
+      <w:r>
+        <w:rPr>
+          <w:lang w:val="es-BO"/>
+        </w:rPr>
+        <w:t xml:space="preserve"> en su </w:t>
+      </w:r>
+      <w:proofErr w:type="spellStart"/>
+      <w:r>
+        <w:rPr>
+          <w:lang w:val="es-BO"/>
+        </w:rPr>
+        <w:t>mayoria</w:t>
+      </w:r>
+      <w:proofErr w:type="spellEnd"/>
+      <w:r>
+        <w:rPr>
+          <w:lang w:val="es-BO"/>
+        </w:rPr>
+        <w:t>)</w:t>
+      </w:r>
+      <w:r>
+        <w:rPr>
+          <w:lang w:val="es-BO"/>
+        </w:rPr>
+        <w:t>.</w:t>
       </w:r>
     </w:p>
     <w:p>
@@ -1973,8 +2031,13 @@
         </w:rPr>
         <w:t>Algoritmo de serpiente, lo que hace es calcular la deformación de cada hueso para simular el endoscopio</w:t>
       </w:r>
-      <w:bookmarkStart w:id="0" w:name="_GoBack"/>
-      <w:bookmarkEnd w:id="0"/>
+    </w:p>
+    <w:p>
+      <w:pPr>
+        <w:rPr>
+          <w:lang w:val="es-BO"/>
+        </w:rPr>
+      </w:pPr>
     </w:p>
     <w:sectPr>
       <w:pgSz w:w="12240" w:h="15840"/>

</xml_diff>